<commit_message>
feat: update SENTINEL_X_SUBMISSION.docx with revised content
</commit_message>
<xml_diff>
--- a/SENTINEL_X_SUBMISSION.docx
+++ b/SENTINEL_X_SUBMISSION.docx
@@ -32,7 +32,7 @@
     </w:p>
     <w:p>
       <w:pPr>
-        <w:spacing w:before="0" w:after="100"/>
+        <w:spacing w:before="0" w:after="60"/>
       </w:pPr>
       <w:r>
         <w:rPr>
@@ -43,6 +43,160 @@
         </w:rPr>
         <w:t xml:space="preserve">AI Defence Lab for Payment Security  |  Mastercard Innovation Challenge @ GFF 2026</w:t>
       </w:r>
+    </w:p>
+    <w:tbl>
+      <w:tblPr>
+        <w:tblW w:w="10318" w:type="dxa"/>
+        <w:tblLayout w:type="fixed"/>
+        <w:tblCellMar>
+          <w:left w:w="60" w:type="dxa"/>
+          <w:right w:w="60" w:type="dxa"/>
+        </w:tblCellMar>
+      </w:tblPr>
+      <w:tr>
+        <w:trPr/>
+        <w:tc>
+          <w:tcPr>
+            <w:tcW w:w="2579" w:type="dxa"/>
+            <w:shd w:val="clear" w:color="auto" w:fill="2B3A4A"/>
+            <w:tcBorders>
+              <w:top w:val="nil"/>
+              <w:left w:val="nil"/>
+              <w:bottom w:val="nil"/>
+              <w:right w:val="nil"/>
+            </w:tcBorders>
+            <w:tcMar>
+              <w:top w:w="60" w:type="dxa"/>
+              <w:left w:w="100" w:type="dxa"/>
+              <w:bottom w:w="60" w:type="dxa"/>
+              <w:right w:w="100" w:type="dxa"/>
+            </w:tcMar>
+            <w:vAlign w:val="center"/>
+          </w:tcPr>
+          <w:p>
+            <w:pPr>
+              <w:jc w:val="center"/>
+              <w:spacing w:before="30" w:after="30"/>
+            </w:pPr>
+            <w:r>
+              <w:rPr>
+                <w:rFonts w:ascii="Calibri" w:hAnsi="Calibri"/>
+                <w:b/>
+                <w:color w:val="FFFFFF"/>
+                <w:sz w:val="15"/>
+              </w:rPr>
+              <w:t xml:space="preserve">90.6% F1</w:t>
+            </w:r>
+          </w:p>
+        </w:tc>
+        <w:tc>
+          <w:tcPr>
+            <w:tcW w:w="2579" w:type="dxa"/>
+            <w:shd w:val="clear" w:color="auto" w:fill="2B3A4A"/>
+            <w:tcBorders>
+              <w:top w:val="nil"/>
+              <w:left w:val="nil"/>
+              <w:bottom w:val="nil"/>
+              <w:right w:val="nil"/>
+            </w:tcBorders>
+            <w:tcMar>
+              <w:top w:w="60" w:type="dxa"/>
+              <w:left w:w="100" w:type="dxa"/>
+              <w:bottom w:w="60" w:type="dxa"/>
+              <w:right w:w="100" w:type="dxa"/>
+            </w:tcMar>
+            <w:vAlign w:val="center"/>
+          </w:tcPr>
+          <w:p>
+            <w:pPr>
+              <w:jc w:val="center"/>
+              <w:spacing w:before="30" w:after="30"/>
+            </w:pPr>
+            <w:r>
+              <w:rPr>
+                <w:rFonts w:ascii="Calibri" w:hAnsi="Calibri"/>
+                <w:b/>
+                <w:color w:val="FFFFFF"/>
+                <w:sz w:val="15"/>
+              </w:rPr>
+              <w:t xml:space="preserve">1.71% FPR</w:t>
+            </w:r>
+          </w:p>
+        </w:tc>
+        <w:tc>
+          <w:tcPr>
+            <w:tcW w:w="2579" w:type="dxa"/>
+            <w:shd w:val="clear" w:color="auto" w:fill="EB001B"/>
+            <w:tcBorders>
+              <w:top w:val="nil"/>
+              <w:left w:val="nil"/>
+              <w:bottom w:val="nil"/>
+              <w:right w:val="nil"/>
+            </w:tcBorders>
+            <w:tcMar>
+              <w:top w:w="60" w:type="dxa"/>
+              <w:left w:w="100" w:type="dxa"/>
+              <w:bottom w:w="60" w:type="dxa"/>
+              <w:right w:w="100" w:type="dxa"/>
+            </w:tcMar>
+            <w:vAlign w:val="center"/>
+          </w:tcPr>
+          <w:p>
+            <w:pPr>
+              <w:jc w:val="center"/>
+              <w:spacing w:before="30" w:after="30"/>
+            </w:pPr>
+            <w:r>
+              <w:rPr>
+                <w:rFonts w:ascii="Calibri" w:hAnsi="Calibri"/>
+                <w:b/>
+                <w:color w:val="FFFFFF"/>
+                <w:sz w:val="15"/>
+              </w:rPr>
+              <w:t xml:space="preserve">81.17% ARG</w:t>
+            </w:r>
+          </w:p>
+        </w:tc>
+        <w:tc>
+          <w:tcPr>
+            <w:tcW w:w="2579" w:type="dxa"/>
+            <w:shd w:val="clear" w:color="auto" w:fill="2B3A4A"/>
+            <w:tcBorders>
+              <w:top w:val="nil"/>
+              <w:left w:val="nil"/>
+              <w:bottom w:val="nil"/>
+              <w:right w:val="nil"/>
+            </w:tcBorders>
+            <w:tcMar>
+              <w:top w:w="60" w:type="dxa"/>
+              <w:left w:w="100" w:type="dxa"/>
+              <w:bottom w:w="60" w:type="dxa"/>
+              <w:right w:w="100" w:type="dxa"/>
+            </w:tcMar>
+            <w:vAlign w:val="center"/>
+          </w:tcPr>
+          <w:p>
+            <w:pPr>
+              <w:jc w:val="center"/>
+              <w:spacing w:before="30" w:after="30"/>
+            </w:pPr>
+            <w:r>
+              <w:rPr>
+                <w:rFonts w:ascii="Calibri" w:hAnsi="Calibri"/>
+                <w:b/>
+                <w:color w:val="FFFFFF"/>
+                <w:sz w:val="15"/>
+              </w:rPr>
+              <w:t xml:space="preserve">7 Zero-Day Clusters</w:t>
+            </w:r>
+          </w:p>
+        </w:tc>
+      </w:tr>
+    </w:tbl>
+    <w:p>
+      <w:pPr>
+        <w:spacing w:before="0" w:after="0" w:line="60" w:lineRule="exact"/>
+      </w:pPr>
     </w:p>
     <w:tbl>
       <w:tblPr>
@@ -5785,7 +5939,7 @@
                 <w:color w:val="FFFFFF"/>
                 <w:sz w:val="17"/>
               </w:rPr>
-              <w:t xml:space="preserve">COUNTERFACTUAL DEFENDER</w:t>
+              <w:t xml:space="preserve">COUNTERFACTUAL DEFENDER — LOCAL EXPLANATION</w:t>
             </w:r>
           </w:p>
           <w:p>
@@ -5812,6 +5966,19 @@
                 <w:sz w:val="14"/>
               </w:rPr>
               <w:t xml:space="preserve">ATKTXN-0416-F10: ₹4,800 BLOCK → ALLOW via amount +1.4% (→₹4,869), count_7d −0.8%. 2 changes. If none of 1,000 samples cross ALLOW: honest “no_nearby_allow_found”.</w:t>
+            </w:r>
+          </w:p>
+          <w:p>
+            <w:pPr>
+              <w:spacing w:before="16" w:after="16" w:line="240" w:lineRule="auto"/>
+            </w:pPr>
+            <w:r>
+              <w:rPr>
+                <w:rFonts w:ascii="Calibri" w:hAnsi="Calibri"/>
+                <w:color w:val="FFFFFF"/>
+                <w:sz w:val="14"/>
+              </w:rPr>
+              <w:t xml:space="preserve">A per-transaction local explanation, not a guaranteed real-world intervention or a globally optimal fraud-prevention action.</w:t>
             </w:r>
           </w:p>
         </w:tc>
@@ -7092,7 +7259,7 @@
           <w:color w:val="5A6670"/>
           <w:sz w:val="11"/>
         </w:rPr>
-        <w:t xml:space="preserve">Economic Impact is always a labeled synthetic benchmark from real generated-attack amounts and real model outcomes — never a production financial-loss claim. Threat Map plots only cities with known fixed coordinates on a proportional grid, not a live banking network.</w:t>
+        <w:t xml:space="preserve">Economic Impact is always a labeled synthetic benchmark from real generated-attack amounts and real model outcomes — never a production financial-loss claim. Threat Map plots only cities with known fixed coordinates on a proportional grid, not a live banking network. 3D Payment Threat Universe: an interactive visualization of discovered attack genomes and threat state, on the Command Center screen.</w:t>
       </w:r>
     </w:p>
     <w:p>

</xml_diff>